<commit_message>
Documentación: capturas del panel nuevo, banda ORCID, eventos por fechas y textos al día
Co-Authored-By: Claude Fable 5 <noreply@anthropic.com>
</commit_message>
<xml_diff>
--- a/docs/manuales/docx/Anexo_A_Especificacion_de_Requisitos.docx
+++ b/docs/manuales/docx/Anexo_A_Especificacion_de_Requisitos.docx
@@ -620,7 +620,7 @@
           <w:sz w:val="22"/>
           <w:szCs w:val="22"/>
         </w:rPr>
-        <w:t xml:space="preserve">	8</w:t>
+        <w:t xml:space="preserve">	9</w:t>
       </w:r>
     </w:p>
     <w:p>
@@ -2226,7 +2226,7 @@
                 <w:sz w:val="22"/>
                 <w:szCs w:val="22"/>
               </w:rPr>
-              <w:t xml:space="preserve">Agenda de eventos con próximos y pasados (tipo, fechas, lugar e imagen opcional) y página del Seminario del IUCE por ediciones anuales, con crónica y actas.</w:t>
+              <w:t xml:space="preserve">Agenda de eventos con próximos y celebrados derivados automáticamente de las fechas (tipo, fechas, lugar e imagen opcional; solo «cancelado» es manual) y página del Seminario del IUCE por ediciones anuales, con crónica y actas.</w:t>
             </w:r>
           </w:p>
         </w:tc>
@@ -2563,7 +2563,7 @@
                 <w:sz w:val="22"/>
                 <w:szCs w:val="22"/>
               </w:rPr>
-              <w:t xml:space="preserve">Presentación de los nueve grupos de investigación oficiales (logo, responsable, distintivo UIC y enlace) y de las publicaciones destacadas de la dirección, con acceso a la producción científica del Portal de la Investigación.</w:t>
+              <w:t xml:space="preserve">Presentación de los nueve grupos de investigación oficiales (logo, responsable, distintivo UIC y enlace) y de los últimos artículos de la dirección, actualizados automáticamente desde sus perfiles públicos de ORCID (con lista editable de reserva), con acceso a la producción científica del Portal de la Investigación.</w:t>
             </w:r>
           </w:p>
         </w:tc>
@@ -5595,7 +5595,7 @@
                 <w:sz w:val="22"/>
                 <w:szCs w:val="22"/>
               </w:rPr>
-              <w:t xml:space="preserve">Resend (entrega de correo transaccional) y, opcionalmente, DeepL (traducción automática al guardar).</w:t>
+              <w:t xml:space="preserve">Resend (entrega de correo transaccional), la API pública de ORCID (últimos artículos de la dirección) y, opcionalmente, DeepL (traducción automática al guardar).</w:t>
             </w:r>
           </w:p>
         </w:tc>

</xml_diff>

<commit_message>
Documentación: diagramas UML oficiales (casos de uso, DFD, ER, estados, secuencia y componentes) generados con matplotlib
Co-Authored-By: Claude Fable 5 <noreply@anthropic.com>
</commit_message>
<xml_diff>
--- a/docs/manuales/docx/Anexo_A_Especificacion_de_Requisitos.docx
+++ b/docs/manuales/docx/Anexo_A_Especificacion_de_Requisitos.docx
@@ -652,6 +652,33 @@
     </w:p>
     <w:p>
       <w:pPr>
+        <w:tabs>
+          <w:tab w:val="right" w:pos="8787" w:leader="dot"/>
+        </w:tabs>
+        <w:spacing w:after="60" w:line="276"/>
+        <w:ind w:left="800"/>
+      </w:pPr>
+      <w:r>
+        <w:rPr>
+          <w:rFonts w:ascii="Times New Roman" w:cs="Times New Roman" w:eastAsia="Times New Roman" w:hAnsi="Times New Roman"/>
+          <w:b w:val="false"/>
+          <w:bCs w:val="false"/>
+          <w:sz w:val="22"/>
+          <w:szCs w:val="22"/>
+        </w:rPr>
+        <w:t xml:space="preserve">A.4.4. Modelo de contexto (DFD)</w:t>
+      </w:r>
+      <w:r>
+        <w:rPr>
+          <w:rFonts w:ascii="Times New Roman" w:cs="Times New Roman" w:eastAsia="Times New Roman" w:hAnsi="Times New Roman"/>
+          <w:sz w:val="22"/>
+          <w:szCs w:val="22"/>
+        </w:rPr>
+        <w:t xml:space="preserve">	13</w:t>
+      </w:r>
+    </w:p>
+    <w:p>
+      <w:pPr>
         <w:pageBreakBefore/>
       </w:pPr>
     </w:p>
@@ -6529,7 +6556,80 @@
           <w:sz w:val="24"/>
           <w:szCs w:val="24"/>
         </w:rPr>
-        <w:t xml:space="preserve">Se documentan los casos de uso que cubren los flujos más representativos del sistema; el resto de operaciones del panel siguen el mismo patrón CRUD.</w:t>
+        <w:t xml:space="preserve">Se documentan los casos de uso que cubren los flujos más representativos del sistema; el resto de operaciones del panel siguen el mismo patrón CRUD. El diagrama siguiente proyecta la jerarquía de actores sobre esas operaciones: cada actor añade sus casos de uso a los del rol del que hereda.</w:t>
+      </w:r>
+    </w:p>
+    <w:p>
+      <w:pPr>
+        <w:spacing w:after="60" w:before="120"/>
+        <w:jc w:val="center"/>
+      </w:pPr>
+      <w:r>
+        <w:drawing>
+          <wp:inline distT="0" distB="0" distL="0" distR="0">
+            <wp:extent cx="4972050" cy="5133975"/>
+            <wp:effectExtent t="0" r="0" b="0" l="0"/>
+            <wp:docPr id="1" name="" descr="" title=""/>
+            <wp:cNvGraphicFramePr>
+              <a:graphicFrameLocks xmlns:a="http://schemas.openxmlformats.org/drawingml/2006/main" noChangeAspect="1"/>
+            </wp:cNvGraphicFramePr>
+            <a:graphic xmlns:a="http://schemas.openxmlformats.org/drawingml/2006/main">
+              <a:graphicData uri="http://schemas.openxmlformats.org/drawingml/2006/picture">
+                <pic:pic xmlns:pic="http://schemas.openxmlformats.org/drawingml/2006/picture">
+                  <pic:nvPicPr>
+                    <pic:cNvPr id="0" name="" descr=""/>
+                    <pic:cNvPicPr>
+                      <a:picLocks noChangeAspect="1" noChangeArrowheads="1"/>
+                    </pic:cNvPicPr>
+                  </pic:nvPicPr>
+                  <pic:blipFill>
+                    <a:blip r:embed="rId12" cstate="none"/>
+                    <a:srcRect/>
+                    <a:stretch>
+                      <a:fillRect/>
+                    </a:stretch>
+                  </pic:blipFill>
+                  <pic:spPr bwMode="auto">
+                    <a:xfrm>
+                      <a:off x="0" y="0"/>
+                      <a:ext cx="4972050" cy="5133975"/>
+                    </a:xfrm>
+                    <a:prstGeom prst="rect">
+                      <a:avLst/>
+                    </a:prstGeom>
+                  </pic:spPr>
+                </pic:pic>
+              </a:graphicData>
+            </a:graphic>
+          </wp:inline>
+        </w:drawing>
+      </w:r>
+    </w:p>
+    <w:p>
+      <w:pPr>
+        <w:keepNext w:val="false"/>
+        <w:spacing w:after="240" w:before="120" w:line="240"/>
+        <w:jc w:val="left"/>
+      </w:pPr>
+      <w:r>
+        <w:rPr>
+          <w:rFonts w:ascii="Times New Roman" w:cs="Times New Roman" w:eastAsia="Times New Roman" w:hAnsi="Times New Roman"/>
+          <w:b/>
+          <w:bCs/>
+          <w:sz w:val="22"/>
+          <w:szCs w:val="22"/>
+        </w:rPr>
+        <w:t xml:space="preserve">Figura 2. </w:t>
+      </w:r>
+      <w:r>
+        <w:rPr>
+          <w:rFonts w:ascii="Times New Roman" w:cs="Times New Roman" w:eastAsia="Times New Roman" w:hAnsi="Times New Roman"/>
+          <w:i/>
+          <w:iCs/>
+          <w:sz w:val="22"/>
+          <w:szCs w:val="22"/>
+        </w:rPr>
+        <w:t xml:space="preserve">Diagrama de casos de uso por rol.</w:t>
       </w:r>
     </w:p>
     <w:tbl>
@@ -10302,6 +10402,110 @@
           <w:szCs w:val="22"/>
         </w:rPr>
         <w:t xml:space="preserve">CU-8 Consultar el sitio en inglés.</w:t>
+      </w:r>
+    </w:p>
+    <w:p>
+      <w:pPr>
+        <w:pStyle w:val="Heading3"/>
+        <w:spacing w:after="140" w:before="300"/>
+      </w:pPr>
+      <w:r>
+        <w:rPr>
+          <w:rFonts w:ascii="Arial" w:cs="Arial" w:eastAsia="Arial" w:hAnsi="Arial"/>
+          <w:b/>
+          <w:bCs/>
+          <w:color w:val="000000"/>
+          <w:sz w:val="24"/>
+          <w:szCs w:val="24"/>
+        </w:rPr>
+        <w:t xml:space="preserve">A.4.4. Modelo de contexto (DFD)</w:t>
+      </w:r>
+    </w:p>
+    <w:p>
+      <w:pPr>
+        <w:spacing w:after="160" w:line="300"/>
+        <w:jc w:val="both"/>
+      </w:pPr>
+      <w:r>
+        <w:rPr>
+          <w:rFonts w:ascii="Times New Roman" w:cs="Times New Roman" w:eastAsia="Times New Roman" w:hAnsi="Times New Roman"/>
+          <w:sz w:val="24"/>
+          <w:szCs w:val="24"/>
+        </w:rPr>
+        <w:t xml:space="preserve">El diagrama de flujo de datos de contexto ofrece la vista complementaria a los casos de uso: en lugar de qué hace cada actor, muestra qué datos cruzan la frontera del sistema y con qué entidades externas. Deja explícitas las dependencias de servicios externos: el servicio de correo (Resend), del que dependen el acceso al área de miembros y los avisos del formulario de contacto; la API pública de ORCID, de la que se obtienen los últimos artículos de la dirección; y DeepL como servicio opcional de traducción al guardar.</w:t>
+      </w:r>
+    </w:p>
+    <w:p>
+      <w:pPr>
+        <w:spacing w:after="60" w:before="120"/>
+        <w:jc w:val="center"/>
+      </w:pPr>
+      <w:r>
+        <w:drawing>
+          <wp:inline distT="0" distB="0" distL="0" distR="0">
+            <wp:extent cx="5400675" cy="3448050"/>
+            <wp:effectExtent t="0" r="0" b="0" l="0"/>
+            <wp:docPr id="1" name="" descr="" title=""/>
+            <wp:cNvGraphicFramePr>
+              <a:graphicFrameLocks xmlns:a="http://schemas.openxmlformats.org/drawingml/2006/main" noChangeAspect="1"/>
+            </wp:cNvGraphicFramePr>
+            <a:graphic xmlns:a="http://schemas.openxmlformats.org/drawingml/2006/main">
+              <a:graphicData uri="http://schemas.openxmlformats.org/drawingml/2006/picture">
+                <pic:pic xmlns:pic="http://schemas.openxmlformats.org/drawingml/2006/picture">
+                  <pic:nvPicPr>
+                    <pic:cNvPr id="0" name="" descr=""/>
+                    <pic:cNvPicPr>
+                      <a:picLocks noChangeAspect="1" noChangeArrowheads="1"/>
+                    </pic:cNvPicPr>
+                  </pic:nvPicPr>
+                  <pic:blipFill>
+                    <a:blip r:embed="rId13" cstate="none"/>
+                    <a:srcRect/>
+                    <a:stretch>
+                      <a:fillRect/>
+                    </a:stretch>
+                  </pic:blipFill>
+                  <pic:spPr bwMode="auto">
+                    <a:xfrm>
+                      <a:off x="0" y="0"/>
+                      <a:ext cx="5400675" cy="3448050"/>
+                    </a:xfrm>
+                    <a:prstGeom prst="rect">
+                      <a:avLst/>
+                    </a:prstGeom>
+                  </pic:spPr>
+                </pic:pic>
+              </a:graphicData>
+            </a:graphic>
+          </wp:inline>
+        </w:drawing>
+      </w:r>
+    </w:p>
+    <w:p>
+      <w:pPr>
+        <w:keepNext w:val="false"/>
+        <w:spacing w:after="240" w:before="120" w:line="240"/>
+        <w:jc w:val="left"/>
+      </w:pPr>
+      <w:r>
+        <w:rPr>
+          <w:rFonts w:ascii="Times New Roman" w:cs="Times New Roman" w:eastAsia="Times New Roman" w:hAnsi="Times New Roman"/>
+          <w:b/>
+          <w:bCs/>
+          <w:sz w:val="22"/>
+          <w:szCs w:val="22"/>
+        </w:rPr>
+        <w:t xml:space="preserve">Figura 3. </w:t>
+      </w:r>
+      <w:r>
+        <w:rPr>
+          <w:rFonts w:ascii="Times New Roman" w:cs="Times New Roman" w:eastAsia="Times New Roman" w:hAnsi="Times New Roman"/>
+          <w:i/>
+          <w:iCs/>
+          <w:sz w:val="22"/>
+          <w:szCs w:val="22"/>
+        </w:rPr>
+        <w:t xml:space="preserve">Diagrama de flujo de datos de contexto (nivel 0).</w:t>
       </w:r>
     </w:p>
     <w:sectPr>

</xml_diff>